<commit_message>
Also added (Reading & writing in parquet, jason, etc ) file format
</commit_message>
<xml_diff>
--- a/New folder/PySpark-File Formats.docx
+++ b/New folder/PySpark-File Formats.docx
@@ -178,10 +178,7 @@
               <w:spacing w:line="240" w:lineRule="auto"/>
             </w:pPr>
             <w:r>
-              <w:t>2,704,STANDARD,PASEO COSTA DEL SUR,PR,NOT ACCEPTABLE,17.96,-66.22,0.38,-0.87,0.3,NA,US,"Paseo Costa Del Sur, PR",NA</w:t>
-            </w:r>
-            <w:r>
-              <w:t>-US-PR-PASEO COSTA DEL SUR,FALSE,,,,</w:t>
+              <w:t>2,704,STANDARD,PASEO COSTA DEL SUR,PR,NOT ACCEPTABLE,17.96,-66.22,0.38,-0.87,0.3,NA,US,"Paseo Costa Del Sur, PR",NA-US-PR-PASEO COSTA DEL SUR,FALSE,,,,</w:t>
             </w:r>
           </w:p>
           <w:p>
@@ -245,10 +242,7 @@
               <w:spacing w:line="240" w:lineRule="auto"/>
             </w:pPr>
             <w:r>
-              <w:t>61393,76177,STANDARD,FT WORTH,TX,ACCEPTABLE,32.</w:t>
-            </w:r>
-            <w:r>
-              <w:t>75,-97.33,-0.1,-0.83,0.54,NA,US,"Ft Worth, TX",NA-US-TX-FT WORTH,FALSE,2126,4053,122396986,</w:t>
+              <w:t>61393,76177,STANDARD,FT WORTH,TX,ACCEPTABLE,32.75,-97.33,-0.1,-0.83,0.54,NA,US,"Ft Worth, TX",NA-US-TX-FT WORTH,FALSE,2126,4053,122396986,</w:t>
             </w:r>
           </w:p>
           <w:p>
@@ -312,10 +306,7 @@
               <w:spacing w:line="240" w:lineRule="auto"/>
             </w:pPr>
             <w:r>
-              <w:t>49345,</w:t>
-            </w:r>
-            <w:r>
-              <w:t>32046,STANDARD,HILLIARD,FL,PRIMARY,30.69,-81.92,0.12,-0.85,0.51,NA,US,"Hilliard, FL",NA-US-FL-HILLIARD,FALSE,3922,7443,133112149,</w:t>
+              <w:t>49345,32046,STANDARD,HILLIARD,FL,PRIMARY,30.69,-81.92,0.12,-0.85,0.51,NA,US,"Hilliard, FL",NA-US-FL-HILLIARD,FALSE,3922,7443,133112149,</w:t>
             </w:r>
           </w:p>
           <w:p>
@@ -379,10 +370,7 @@
               <w:spacing w:line="240" w:lineRule="auto"/>
             </w:pPr>
             <w:r>
-              <w:t xml:space="preserve">10,708,STANDARD,BDA SAN </w:t>
-            </w:r>
-            <w:r>
-              <w:t>LUIS,PR,NOT ACCEPTABLE,18.14,-66.26,0.38,-0.86,0.31,NA,US,"Bda San Luis, PR",NA-US-PR-BDA SAN LUIS,FALSE,,,,</w:t>
+              <w:t>10,708,STANDARD,BDA SAN LUIS,PR,NOT ACCEPTABLE,18.14,-66.26,0.38,-0.86,0.31,NA,US,"Bda San Luis, PR",NA-US-PR-BDA SAN LUIS,FALSE,,,,</w:t>
             </w:r>
           </w:p>
           <w:p>
@@ -438,10 +426,7 @@
               <w:spacing w:line="240" w:lineRule="auto"/>
             </w:pPr>
             <w:r>
-              <w:t>54355,35146,STANDARD,SPRINGVILLE,AL,PRIMARY,33.77,-86.47,0.05,-0.82,0.55,NA,US,"Springville, AL",NA-US-AL-SPRINGVILLE,FALSE</w:t>
-            </w:r>
-            <w:r>
-              <w:t>,4046,7845,172127599,</w:t>
+              <w:t>54355,35146,STANDARD,SPRINGVILLE,AL,PRIMARY,33.77,-86.47,0.05,-0.82,0.55,NA,US,"Springville, AL",NA-US-AL-SPRINGVILLE,FALSE,4046,7845,172127599,</w:t>
             </w:r>
           </w:p>
           <w:p>
@@ -517,10 +502,7 @@
             </w:r>
             <w:r>
               <w:lastRenderedPageBreak/>
-              <w:t>0.79,0.</w:t>
-            </w:r>
-            <w:r>
-              <w:t>58,NA,US,"Asheboro, NC",NA-US-NC-ASHEBORO,FALSE,1035,1816,30322473,</w:t>
+              <w:t>0.79,0.58,NA,US,"Asheboro, NC",NA-US-NC-ASHEBORO,FALSE,1035,1816,30322473,</w:t>
             </w:r>
           </w:p>
           <w:p>
@@ -1811,13 +1793,7 @@
         <w:rPr>
           <w:shd w:val="clear" w:color="auto" w:fill="F9F9F9"/>
         </w:rPr>
-        <w:t>This option is used to read the first line of the CSV file as column names. By default</w:t>
-      </w:r>
-      <w:r>
-        <w:rPr>
-          <w:shd w:val="clear" w:color="auto" w:fill="F9F9F9"/>
-        </w:rPr>
-        <w:t xml:space="preserve"> the value of this option is </w:t>
+        <w:t xml:space="preserve">This option is used to read the first line of the CSV file as column names. By default the value of this option is </w:t>
       </w:r>
       <w:r>
         <w:rPr>
@@ -3977,13 +3953,7 @@
               <w:rPr>
                 <w:shd w:val="clear" w:color="auto" w:fill="F9F9F9"/>
               </w:rPr>
-              <w:t>df_with_schema.write</w:t>
-            </w:r>
-            <w:r>
-              <w:rPr>
-                <w:shd w:val="clear" w:color="auto" w:fill="F9F9F9"/>
-              </w:rPr>
-              <w:t>.mode('overwrite').csv("file:///tmp/spark_output/zipcodes")</w:t>
+              <w:t>df_with_schema.write.mode('overwrite').csv("file:///tmp/spark_output/zipcodes")</w:t>
             </w:r>
           </w:p>
           <w:p>
@@ -4094,6 +4064,1437 @@
                 <w:right w:val="nil"/>
                 <w:between w:val="nil"/>
               </w:pBdr>
+              <w:spacing w:line="240" w:lineRule="auto"/>
+              <w:rPr>
+                <w:shd w:val="clear" w:color="auto" w:fill="F9F9F9"/>
+              </w:rPr>
+            </w:pPr>
+          </w:p>
+        </w:tc>
+      </w:tr>
+    </w:tbl>
+    <w:p>
+      <w:pPr>
+        <w:spacing w:line="240" w:lineRule="auto"/>
+        <w:rPr>
+          <w:shd w:val="clear" w:color="auto" w:fill="F9F9F9"/>
+        </w:rPr>
+      </w:pPr>
+    </w:p>
+    <w:p>
+      <w:pPr>
+        <w:spacing w:line="240" w:lineRule="auto"/>
+        <w:rPr>
+          <w:shd w:val="clear" w:color="auto" w:fill="F9F9F9"/>
+        </w:rPr>
+      </w:pPr>
+      <w:r>
+        <w:rPr>
+          <w:shd w:val="clear" w:color="auto" w:fill="F9F9F9"/>
+        </w:rPr>
+        <w:t xml:space="preserve">*************************************** </w:t>
+      </w:r>
+      <w:r>
+        <w:rPr>
+          <w:b/>
+          <w:shd w:val="clear" w:color="auto" w:fill="F9F9F9"/>
+        </w:rPr>
+        <w:t>Parquet</w:t>
+      </w:r>
+      <w:r>
+        <w:rPr>
+          <w:shd w:val="clear" w:color="auto" w:fill="F9F9F9"/>
+        </w:rPr>
+        <w:t xml:space="preserve"> ****************************************</w:t>
+      </w:r>
+    </w:p>
+    <w:p>
+      <w:pPr>
+        <w:spacing w:line="240" w:lineRule="auto"/>
+        <w:rPr>
+          <w:shd w:val="clear" w:color="auto" w:fill="F9F9F9"/>
+        </w:rPr>
+      </w:pPr>
+    </w:p>
+    <w:p>
+      <w:pPr>
+        <w:spacing w:line="240" w:lineRule="auto"/>
+        <w:rPr>
+          <w:shd w:val="clear" w:color="auto" w:fill="F9F9F9"/>
+        </w:rPr>
+      </w:pPr>
+    </w:p>
+    <w:p>
+      <w:pPr>
+        <w:spacing w:line="240" w:lineRule="auto"/>
+        <w:rPr>
+          <w:shd w:val="clear" w:color="auto" w:fill="F9F9F9"/>
+        </w:rPr>
+      </w:pPr>
+    </w:p>
+    <w:p>
+      <w:pPr>
+        <w:spacing w:line="240" w:lineRule="auto"/>
+        <w:rPr>
+          <w:b/>
+          <w:shd w:val="clear" w:color="auto" w:fill="F9F9F9"/>
+        </w:rPr>
+      </w:pPr>
+      <w:bookmarkStart w:id="6" w:name="_2fs70yfw26sj"/>
+      <w:bookmarkEnd w:id="6"/>
+      <w:proofErr w:type="spellStart"/>
+      <w:r>
+        <w:rPr>
+          <w:b/>
+          <w:shd w:val="clear" w:color="auto" w:fill="F9F9F9"/>
+        </w:rPr>
+        <w:t>Pyspark</w:t>
+      </w:r>
+      <w:proofErr w:type="spellEnd"/>
+      <w:r>
+        <w:rPr>
+          <w:b/>
+          <w:shd w:val="clear" w:color="auto" w:fill="F9F9F9"/>
+        </w:rPr>
+        <w:t xml:space="preserve"> Write </w:t>
+      </w:r>
+      <w:proofErr w:type="spellStart"/>
+      <w:r>
+        <w:rPr>
+          <w:b/>
+          <w:shd w:val="clear" w:color="auto" w:fill="F9F9F9"/>
+        </w:rPr>
+        <w:t>DataFrame</w:t>
+      </w:r>
+      <w:proofErr w:type="spellEnd"/>
+      <w:r>
+        <w:rPr>
+          <w:b/>
+          <w:shd w:val="clear" w:color="auto" w:fill="F9F9F9"/>
+        </w:rPr>
+        <w:t xml:space="preserve"> to Parquet file format</w:t>
+      </w:r>
+    </w:p>
+    <w:p>
+      <w:pPr>
+        <w:spacing w:line="240" w:lineRule="auto"/>
+        <w:rPr>
+          <w:shd w:val="clear" w:color="auto" w:fill="F9F9F9"/>
+        </w:rPr>
+      </w:pPr>
+    </w:p>
+    <w:tbl>
+      <w:tblPr>
+        <w:tblW w:w="9030" w:type="dxa"/>
+        <w:tblBorders>
+          <w:top w:val="single" w:sz="8" w:space="0" w:color="000000"/>
+          <w:left w:val="single" w:sz="8" w:space="0" w:color="000000"/>
+          <w:bottom w:val="single" w:sz="8" w:space="0" w:color="000000"/>
+          <w:right w:val="single" w:sz="8" w:space="0" w:color="000000"/>
+          <w:insideH w:val="single" w:sz="8" w:space="0" w:color="000000"/>
+          <w:insideV w:val="single" w:sz="8" w:space="0" w:color="000000"/>
+        </w:tblBorders>
+        <w:tblLayout w:type="fixed"/>
+        <w:tblLook w:val="0600" w:firstRow="0" w:lastRow="0" w:firstColumn="0" w:lastColumn="0" w:noHBand="1" w:noVBand="1"/>
+      </w:tblPr>
+      <w:tblGrid>
+        <w:gridCol w:w="9030"/>
+      </w:tblGrid>
+      <w:tr>
+        <w:tc>
+          <w:tcPr>
+            <w:tcW w:w="9029" w:type="dxa"/>
+            <w:tcBorders>
+              <w:top w:val="single" w:sz="8" w:space="0" w:color="000000"/>
+              <w:left w:val="single" w:sz="8" w:space="0" w:color="000000"/>
+              <w:bottom w:val="single" w:sz="8" w:space="0" w:color="000000"/>
+              <w:right w:val="single" w:sz="8" w:space="0" w:color="000000"/>
+            </w:tcBorders>
+            <w:tcMar>
+              <w:top w:w="100" w:type="dxa"/>
+              <w:left w:w="100" w:type="dxa"/>
+              <w:bottom w:w="100" w:type="dxa"/>
+              <w:right w:w="100" w:type="dxa"/>
+            </w:tcMar>
+          </w:tcPr>
+          <w:p>
+            <w:pPr>
+              <w:spacing w:line="240" w:lineRule="auto"/>
+              <w:rPr>
+                <w:shd w:val="clear" w:color="auto" w:fill="F9F9F9"/>
+              </w:rPr>
+            </w:pPr>
+            <w:r>
+              <w:rPr>
+                <w:shd w:val="clear" w:color="auto" w:fill="F9F9F9"/>
+              </w:rPr>
+              <w:t>data =[("James ","","Smith","36636","M",3000),</w:t>
+            </w:r>
+          </w:p>
+          <w:p>
+            <w:pPr>
+              <w:spacing w:line="240" w:lineRule="auto"/>
+              <w:rPr>
+                <w:shd w:val="clear" w:color="auto" w:fill="F9F9F9"/>
+              </w:rPr>
+            </w:pPr>
+            <w:r>
+              <w:rPr>
+                <w:shd w:val="clear" w:color="auto" w:fill="F9F9F9"/>
+              </w:rPr>
+              <w:t xml:space="preserve">              ("Michael ","Rose","","40288","M",4000),</w:t>
+            </w:r>
+          </w:p>
+          <w:p>
+            <w:pPr>
+              <w:spacing w:line="240" w:lineRule="auto"/>
+              <w:rPr>
+                <w:shd w:val="clear" w:color="auto" w:fill="F9F9F9"/>
+              </w:rPr>
+            </w:pPr>
+            <w:r>
+              <w:rPr>
+                <w:shd w:val="clear" w:color="auto" w:fill="F9F9F9"/>
+              </w:rPr>
+              <w:t xml:space="preserve">              ("Robert ","","Williams","42114","M",4000),</w:t>
+            </w:r>
+          </w:p>
+          <w:p>
+            <w:pPr>
+              <w:spacing w:line="240" w:lineRule="auto"/>
+              <w:rPr>
+                <w:shd w:val="clear" w:color="auto" w:fill="F9F9F9"/>
+              </w:rPr>
+            </w:pPr>
+            <w:r>
+              <w:rPr>
+                <w:shd w:val="clear" w:color="auto" w:fill="F9F9F9"/>
+              </w:rPr>
+              <w:t xml:space="preserve">              ("Maria ","Anne","Jones","39192","F",4000),</w:t>
+            </w:r>
+          </w:p>
+          <w:p>
+            <w:pPr>
+              <w:spacing w:line="240" w:lineRule="auto"/>
+              <w:rPr>
+                <w:shd w:val="clear" w:color="auto" w:fill="F9F9F9"/>
+              </w:rPr>
+            </w:pPr>
+            <w:r>
+              <w:rPr>
+                <w:shd w:val="clear" w:color="auto" w:fill="F9F9F9"/>
+              </w:rPr>
+              <w:t xml:space="preserve">              ("Jen","Mary","Brown","","F",-1)]</w:t>
+            </w:r>
+          </w:p>
+          <w:p>
+            <w:pPr>
+              <w:spacing w:line="240" w:lineRule="auto"/>
+              <w:rPr>
+                <w:shd w:val="clear" w:color="auto" w:fill="F9F9F9"/>
+              </w:rPr>
+            </w:pPr>
+            <w:r>
+              <w:rPr>
+                <w:shd w:val="clear" w:color="auto" w:fill="F9F9F9"/>
+              </w:rPr>
+              <w:t>columns=["firstname","middlename","lastname","dob","gender","salary"]</w:t>
+            </w:r>
+          </w:p>
+          <w:p>
+            <w:pPr>
+              <w:spacing w:line="240" w:lineRule="auto"/>
+              <w:rPr>
+                <w:shd w:val="clear" w:color="auto" w:fill="F9F9F9"/>
+              </w:rPr>
+            </w:pPr>
+          </w:p>
+          <w:p>
+            <w:pPr>
+              <w:spacing w:line="240" w:lineRule="auto"/>
+              <w:rPr>
+                <w:shd w:val="clear" w:color="auto" w:fill="F9F9F9"/>
+              </w:rPr>
+            </w:pPr>
+            <w:proofErr w:type="spellStart"/>
+            <w:r>
+              <w:rPr>
+                <w:shd w:val="clear" w:color="auto" w:fill="F9F9F9"/>
+              </w:rPr>
+              <w:t>df</w:t>
+            </w:r>
+            <w:proofErr w:type="spellEnd"/>
+            <w:r>
+              <w:rPr>
+                <w:shd w:val="clear" w:color="auto" w:fill="F9F9F9"/>
+              </w:rPr>
+              <w:t>=</w:t>
+            </w:r>
+            <w:proofErr w:type="spellStart"/>
+            <w:r>
+              <w:rPr>
+                <w:shd w:val="clear" w:color="auto" w:fill="F9F9F9"/>
+              </w:rPr>
+              <w:t>spark.createDataFrame</w:t>
+            </w:r>
+            <w:proofErr w:type="spellEnd"/>
+            <w:r>
+              <w:rPr>
+                <w:shd w:val="clear" w:color="auto" w:fill="F9F9F9"/>
+              </w:rPr>
+              <w:t>(</w:t>
+            </w:r>
+            <w:proofErr w:type="spellStart"/>
+            <w:r>
+              <w:rPr>
+                <w:shd w:val="clear" w:color="auto" w:fill="F9F9F9"/>
+              </w:rPr>
+              <w:t>data,columns</w:t>
+            </w:r>
+            <w:proofErr w:type="spellEnd"/>
+            <w:r>
+              <w:rPr>
+                <w:shd w:val="clear" w:color="auto" w:fill="F9F9F9"/>
+              </w:rPr>
+              <w:t>)</w:t>
+            </w:r>
+          </w:p>
+          <w:p>
+            <w:pPr>
+              <w:spacing w:line="240" w:lineRule="auto"/>
+              <w:rPr>
+                <w:shd w:val="clear" w:color="auto" w:fill="F9F9F9"/>
+              </w:rPr>
+            </w:pPr>
+            <w:proofErr w:type="spellStart"/>
+            <w:r>
+              <w:rPr>
+                <w:shd w:val="clear" w:color="auto" w:fill="F9F9F9"/>
+              </w:rPr>
+              <w:t>df.write.parquet</w:t>
+            </w:r>
+            <w:proofErr w:type="spellEnd"/>
+            <w:r>
+              <w:rPr>
+                <w:shd w:val="clear" w:color="auto" w:fill="F9F9F9"/>
+              </w:rPr>
+              <w:t>("file:///tmp/output/people.parquet")</w:t>
+            </w:r>
+          </w:p>
+          <w:p>
+            <w:pPr>
+              <w:spacing w:line="240" w:lineRule="auto"/>
+              <w:rPr>
+                <w:shd w:val="clear" w:color="auto" w:fill="F9F9F9"/>
+              </w:rPr>
+            </w:pPr>
+          </w:p>
+        </w:tc>
+      </w:tr>
+    </w:tbl>
+    <w:p>
+      <w:pPr>
+        <w:spacing w:line="240" w:lineRule="auto"/>
+        <w:rPr>
+          <w:shd w:val="clear" w:color="auto" w:fill="F9F9F9"/>
+        </w:rPr>
+      </w:pPr>
+    </w:p>
+    <w:p>
+      <w:pPr>
+        <w:spacing w:line="240" w:lineRule="auto"/>
+        <w:rPr>
+          <w:b/>
+          <w:shd w:val="clear" w:color="auto" w:fill="F9F9F9"/>
+        </w:rPr>
+      </w:pPr>
+      <w:bookmarkStart w:id="7" w:name="_t7e3xm8n9wmt"/>
+      <w:bookmarkEnd w:id="7"/>
+      <w:r>
+        <w:rPr>
+          <w:b/>
+          <w:shd w:val="clear" w:color="auto" w:fill="F9F9F9"/>
+        </w:rPr>
+        <w:t xml:space="preserve">Read Parquet file into </w:t>
+      </w:r>
+      <w:proofErr w:type="spellStart"/>
+      <w:r>
+        <w:rPr>
+          <w:b/>
+          <w:shd w:val="clear" w:color="auto" w:fill="F9F9F9"/>
+        </w:rPr>
+        <w:t>DataFrame</w:t>
+      </w:r>
+      <w:proofErr w:type="spellEnd"/>
+    </w:p>
+    <w:p>
+      <w:pPr>
+        <w:spacing w:line="240" w:lineRule="auto"/>
+        <w:rPr>
+          <w:shd w:val="clear" w:color="auto" w:fill="F9F9F9"/>
+        </w:rPr>
+      </w:pPr>
+    </w:p>
+    <w:tbl>
+      <w:tblPr>
+        <w:tblW w:w="9030" w:type="dxa"/>
+        <w:tblBorders>
+          <w:top w:val="single" w:sz="8" w:space="0" w:color="000000"/>
+          <w:left w:val="single" w:sz="8" w:space="0" w:color="000000"/>
+          <w:bottom w:val="single" w:sz="8" w:space="0" w:color="000000"/>
+          <w:right w:val="single" w:sz="8" w:space="0" w:color="000000"/>
+          <w:insideH w:val="single" w:sz="8" w:space="0" w:color="000000"/>
+          <w:insideV w:val="single" w:sz="8" w:space="0" w:color="000000"/>
+        </w:tblBorders>
+        <w:tblLayout w:type="fixed"/>
+        <w:tblLook w:val="0600" w:firstRow="0" w:lastRow="0" w:firstColumn="0" w:lastColumn="0" w:noHBand="1" w:noVBand="1"/>
+      </w:tblPr>
+      <w:tblGrid>
+        <w:gridCol w:w="9030"/>
+      </w:tblGrid>
+      <w:tr>
+        <w:tc>
+          <w:tcPr>
+            <w:tcW w:w="9029" w:type="dxa"/>
+            <w:tcBorders>
+              <w:top w:val="single" w:sz="8" w:space="0" w:color="000000"/>
+              <w:left w:val="single" w:sz="8" w:space="0" w:color="000000"/>
+              <w:bottom w:val="single" w:sz="8" w:space="0" w:color="000000"/>
+              <w:right w:val="single" w:sz="8" w:space="0" w:color="000000"/>
+            </w:tcBorders>
+            <w:tcMar>
+              <w:top w:w="100" w:type="dxa"/>
+              <w:left w:w="100" w:type="dxa"/>
+              <w:bottom w:w="100" w:type="dxa"/>
+              <w:right w:w="100" w:type="dxa"/>
+            </w:tcMar>
+          </w:tcPr>
+          <w:p>
+            <w:pPr>
+              <w:spacing w:line="240" w:lineRule="auto"/>
+              <w:rPr>
+                <w:shd w:val="clear" w:color="auto" w:fill="F9F9F9"/>
+              </w:rPr>
+            </w:pPr>
+          </w:p>
+          <w:p>
+            <w:pPr>
+              <w:spacing w:line="240" w:lineRule="auto"/>
+              <w:rPr>
+                <w:shd w:val="clear" w:color="auto" w:fill="F9F9F9"/>
+              </w:rPr>
+            </w:pPr>
+            <w:proofErr w:type="spellStart"/>
+            <w:r>
+              <w:rPr>
+                <w:shd w:val="clear" w:color="auto" w:fill="F9F9F9"/>
+              </w:rPr>
+              <w:t>parDF</w:t>
+            </w:r>
+            <w:proofErr w:type="spellEnd"/>
+            <w:r>
+              <w:rPr>
+                <w:shd w:val="clear" w:color="auto" w:fill="F9F9F9"/>
+              </w:rPr>
+              <w:t>=</w:t>
+            </w:r>
+            <w:proofErr w:type="spellStart"/>
+            <w:r>
+              <w:rPr>
+                <w:shd w:val="clear" w:color="auto" w:fill="F9F9F9"/>
+              </w:rPr>
+              <w:t>spark.read.parquet</w:t>
+            </w:r>
+            <w:proofErr w:type="spellEnd"/>
+            <w:r>
+              <w:rPr>
+                <w:shd w:val="clear" w:color="auto" w:fill="F9F9F9"/>
+              </w:rPr>
+              <w:t>("file:///tmp/output/people.parquet")</w:t>
+            </w:r>
+          </w:p>
+          <w:p>
+            <w:pPr>
+              <w:spacing w:line="240" w:lineRule="auto"/>
+              <w:rPr>
+                <w:shd w:val="clear" w:color="auto" w:fill="F9F9F9"/>
+              </w:rPr>
+            </w:pPr>
+          </w:p>
+        </w:tc>
+      </w:tr>
+    </w:tbl>
+    <w:p>
+      <w:pPr>
+        <w:spacing w:line="240" w:lineRule="auto"/>
+        <w:rPr>
+          <w:shd w:val="clear" w:color="auto" w:fill="F9F9F9"/>
+        </w:rPr>
+      </w:pPr>
+    </w:p>
+    <w:p>
+      <w:pPr>
+        <w:spacing w:line="240" w:lineRule="auto"/>
+        <w:rPr>
+          <w:shd w:val="clear" w:color="auto" w:fill="F9F9F9"/>
+        </w:rPr>
+      </w:pPr>
+      <w:bookmarkStart w:id="8" w:name="_mrh2qiofk07b"/>
+      <w:bookmarkEnd w:id="8"/>
+      <w:r>
+        <w:rPr>
+          <w:b/>
+          <w:shd w:val="clear" w:color="auto" w:fill="F9F9F9"/>
+        </w:rPr>
+        <w:t xml:space="preserve">SQL queries </w:t>
+      </w:r>
+      <w:proofErr w:type="spellStart"/>
+      <w:r>
+        <w:rPr>
+          <w:b/>
+          <w:shd w:val="clear" w:color="auto" w:fill="F9F9F9"/>
+        </w:rPr>
+        <w:t>DataFrame</w:t>
+      </w:r>
+      <w:proofErr w:type="spellEnd"/>
+    </w:p>
+    <w:tbl>
+      <w:tblPr>
+        <w:tblW w:w="9030" w:type="dxa"/>
+        <w:tblBorders>
+          <w:top w:val="single" w:sz="8" w:space="0" w:color="000000"/>
+          <w:left w:val="single" w:sz="8" w:space="0" w:color="000000"/>
+          <w:bottom w:val="single" w:sz="8" w:space="0" w:color="000000"/>
+          <w:right w:val="single" w:sz="8" w:space="0" w:color="000000"/>
+          <w:insideH w:val="single" w:sz="8" w:space="0" w:color="000000"/>
+          <w:insideV w:val="single" w:sz="8" w:space="0" w:color="000000"/>
+        </w:tblBorders>
+        <w:tblLayout w:type="fixed"/>
+        <w:tblLook w:val="0600" w:firstRow="0" w:lastRow="0" w:firstColumn="0" w:lastColumn="0" w:noHBand="1" w:noVBand="1"/>
+      </w:tblPr>
+      <w:tblGrid>
+        <w:gridCol w:w="9030"/>
+      </w:tblGrid>
+      <w:tr>
+        <w:tc>
+          <w:tcPr>
+            <w:tcW w:w="9029" w:type="dxa"/>
+            <w:tcBorders>
+              <w:top w:val="single" w:sz="8" w:space="0" w:color="000000"/>
+              <w:left w:val="single" w:sz="8" w:space="0" w:color="000000"/>
+              <w:bottom w:val="single" w:sz="8" w:space="0" w:color="000000"/>
+              <w:right w:val="single" w:sz="8" w:space="0" w:color="000000"/>
+            </w:tcBorders>
+            <w:tcMar>
+              <w:top w:w="100" w:type="dxa"/>
+              <w:left w:w="100" w:type="dxa"/>
+              <w:bottom w:w="100" w:type="dxa"/>
+              <w:right w:w="100" w:type="dxa"/>
+            </w:tcMar>
+          </w:tcPr>
+          <w:p>
+            <w:pPr>
+              <w:spacing w:line="240" w:lineRule="auto"/>
+              <w:rPr>
+                <w:shd w:val="clear" w:color="auto" w:fill="F9F9F9"/>
+              </w:rPr>
+            </w:pPr>
+          </w:p>
+          <w:p>
+            <w:pPr>
+              <w:spacing w:line="240" w:lineRule="auto"/>
+              <w:rPr>
+                <w:shd w:val="clear" w:color="auto" w:fill="F9F9F9"/>
+              </w:rPr>
+            </w:pPr>
+            <w:proofErr w:type="spellStart"/>
+            <w:r>
+              <w:rPr>
+                <w:shd w:val="clear" w:color="auto" w:fill="F9F9F9"/>
+              </w:rPr>
+              <w:t>parDF.createOrReplaceTempView</w:t>
+            </w:r>
+            <w:proofErr w:type="spellEnd"/>
+            <w:r>
+              <w:rPr>
+                <w:shd w:val="clear" w:color="auto" w:fill="F9F9F9"/>
+              </w:rPr>
+              <w:t>("</w:t>
+            </w:r>
+            <w:proofErr w:type="spellStart"/>
+            <w:r>
+              <w:rPr>
+                <w:shd w:val="clear" w:color="auto" w:fill="F9F9F9"/>
+              </w:rPr>
+              <w:t>ParquetTable</w:t>
+            </w:r>
+            <w:proofErr w:type="spellEnd"/>
+            <w:r>
+              <w:rPr>
+                <w:shd w:val="clear" w:color="auto" w:fill="F9F9F9"/>
+              </w:rPr>
+              <w:t>")</w:t>
+            </w:r>
+          </w:p>
+          <w:p>
+            <w:pPr>
+              <w:spacing w:line="240" w:lineRule="auto"/>
+              <w:rPr>
+                <w:shd w:val="clear" w:color="auto" w:fill="F9F9F9"/>
+              </w:rPr>
+            </w:pPr>
+            <w:proofErr w:type="spellStart"/>
+            <w:r>
+              <w:rPr>
+                <w:shd w:val="clear" w:color="auto" w:fill="F9F9F9"/>
+              </w:rPr>
+              <w:t>parkSQL</w:t>
+            </w:r>
+            <w:proofErr w:type="spellEnd"/>
+            <w:r>
+              <w:rPr>
+                <w:shd w:val="clear" w:color="auto" w:fill="F9F9F9"/>
+              </w:rPr>
+              <w:t xml:space="preserve"> = </w:t>
+            </w:r>
+            <w:proofErr w:type="spellStart"/>
+            <w:r>
+              <w:rPr>
+                <w:shd w:val="clear" w:color="auto" w:fill="F9F9F9"/>
+              </w:rPr>
+              <w:t>spark.sql</w:t>
+            </w:r>
+            <w:proofErr w:type="spellEnd"/>
+            <w:r>
+              <w:rPr>
+                <w:shd w:val="clear" w:color="auto" w:fill="F9F9F9"/>
+              </w:rPr>
+              <w:t xml:space="preserve">("select * from </w:t>
+            </w:r>
+            <w:proofErr w:type="spellStart"/>
+            <w:r>
+              <w:rPr>
+                <w:shd w:val="clear" w:color="auto" w:fill="F9F9F9"/>
+              </w:rPr>
+              <w:t>ParquetTable</w:t>
+            </w:r>
+            <w:proofErr w:type="spellEnd"/>
+            <w:r>
+              <w:rPr>
+                <w:shd w:val="clear" w:color="auto" w:fill="F9F9F9"/>
+              </w:rPr>
+              <w:t xml:space="preserve"> where salary &gt;= 4000 ")</w:t>
+            </w:r>
+          </w:p>
+          <w:p>
+            <w:pPr>
+              <w:spacing w:line="240" w:lineRule="auto"/>
+              <w:rPr>
+                <w:shd w:val="clear" w:color="auto" w:fill="F9F9F9"/>
+              </w:rPr>
+            </w:pPr>
+            <w:proofErr w:type="spellStart"/>
+            <w:r>
+              <w:rPr>
+                <w:shd w:val="clear" w:color="auto" w:fill="F9F9F9"/>
+              </w:rPr>
+              <w:t>parkSQL.show</w:t>
+            </w:r>
+            <w:proofErr w:type="spellEnd"/>
+            <w:r>
+              <w:rPr>
+                <w:shd w:val="clear" w:color="auto" w:fill="F9F9F9"/>
+              </w:rPr>
+              <w:t>()</w:t>
+            </w:r>
+          </w:p>
+        </w:tc>
+      </w:tr>
+    </w:tbl>
+    <w:p>
+      <w:pPr>
+        <w:spacing w:line="240" w:lineRule="auto"/>
+        <w:rPr>
+          <w:shd w:val="clear" w:color="auto" w:fill="F9F9F9"/>
+        </w:rPr>
+      </w:pPr>
+    </w:p>
+    <w:p>
+      <w:pPr>
+        <w:spacing w:line="240" w:lineRule="auto"/>
+        <w:rPr>
+          <w:shd w:val="clear" w:color="auto" w:fill="F9F9F9"/>
+        </w:rPr>
+      </w:pPr>
+    </w:p>
+    <w:p>
+      <w:pPr>
+        <w:spacing w:line="240" w:lineRule="auto"/>
+        <w:rPr>
+          <w:shd w:val="clear" w:color="auto" w:fill="F9F9F9"/>
+        </w:rPr>
+      </w:pPr>
+      <w:r>
+        <w:rPr>
+          <w:shd w:val="clear" w:color="auto" w:fill="F9F9F9"/>
+        </w:rPr>
+        <w:t xml:space="preserve">*************************************** </w:t>
+      </w:r>
+      <w:r>
+        <w:rPr>
+          <w:b/>
+          <w:shd w:val="clear" w:color="auto" w:fill="F9F9F9"/>
+        </w:rPr>
+        <w:t>ORC</w:t>
+      </w:r>
+      <w:r>
+        <w:rPr>
+          <w:shd w:val="clear" w:color="auto" w:fill="F9F9F9"/>
+        </w:rPr>
+        <w:t xml:space="preserve"> ****************************************</w:t>
+      </w:r>
+    </w:p>
+    <w:p>
+      <w:pPr>
+        <w:spacing w:line="240" w:lineRule="auto"/>
+        <w:rPr>
+          <w:shd w:val="clear" w:color="auto" w:fill="F9F9F9"/>
+        </w:rPr>
+      </w:pPr>
+    </w:p>
+    <w:p>
+      <w:pPr>
+        <w:spacing w:line="240" w:lineRule="auto"/>
+        <w:rPr>
+          <w:shd w:val="clear" w:color="auto" w:fill="F9F9F9"/>
+        </w:rPr>
+      </w:pPr>
+    </w:p>
+    <w:tbl>
+      <w:tblPr>
+        <w:tblW w:w="9030" w:type="dxa"/>
+        <w:tblBorders>
+          <w:top w:val="single" w:sz="8" w:space="0" w:color="000000"/>
+          <w:left w:val="single" w:sz="8" w:space="0" w:color="000000"/>
+          <w:bottom w:val="single" w:sz="8" w:space="0" w:color="000000"/>
+          <w:right w:val="single" w:sz="8" w:space="0" w:color="000000"/>
+          <w:insideH w:val="single" w:sz="8" w:space="0" w:color="000000"/>
+          <w:insideV w:val="single" w:sz="8" w:space="0" w:color="000000"/>
+        </w:tblBorders>
+        <w:tblLayout w:type="fixed"/>
+        <w:tblLook w:val="0600" w:firstRow="0" w:lastRow="0" w:firstColumn="0" w:lastColumn="0" w:noHBand="1" w:noVBand="1"/>
+      </w:tblPr>
+      <w:tblGrid>
+        <w:gridCol w:w="9030"/>
+      </w:tblGrid>
+      <w:tr>
+        <w:tc>
+          <w:tcPr>
+            <w:tcW w:w="9029" w:type="dxa"/>
+            <w:tcBorders>
+              <w:top w:val="single" w:sz="8" w:space="0" w:color="000000"/>
+              <w:left w:val="single" w:sz="8" w:space="0" w:color="000000"/>
+              <w:bottom w:val="single" w:sz="8" w:space="0" w:color="000000"/>
+              <w:right w:val="single" w:sz="8" w:space="0" w:color="000000"/>
+            </w:tcBorders>
+            <w:tcMar>
+              <w:top w:w="100" w:type="dxa"/>
+              <w:left w:w="100" w:type="dxa"/>
+              <w:bottom w:w="100" w:type="dxa"/>
+              <w:right w:w="100" w:type="dxa"/>
+            </w:tcMar>
+          </w:tcPr>
+          <w:p>
+            <w:pPr>
+              <w:spacing w:line="240" w:lineRule="auto"/>
+              <w:rPr>
+                <w:shd w:val="clear" w:color="auto" w:fill="F9F9F9"/>
+              </w:rPr>
+            </w:pPr>
+          </w:p>
+          <w:p>
+            <w:pPr>
+              <w:spacing w:line="240" w:lineRule="auto"/>
+              <w:rPr>
+                <w:shd w:val="clear" w:color="auto" w:fill="F9F9F9"/>
+              </w:rPr>
+            </w:pPr>
+            <w:proofErr w:type="spellStart"/>
+            <w:r>
+              <w:rPr>
+                <w:shd w:val="clear" w:color="auto" w:fill="F9F9F9"/>
+              </w:rPr>
+              <w:t>parDF.write.orc</w:t>
+            </w:r>
+            <w:proofErr w:type="spellEnd"/>
+            <w:r>
+              <w:rPr>
+                <w:shd w:val="clear" w:color="auto" w:fill="F9F9F9"/>
+              </w:rPr>
+              <w:t>("file:///tmp/orc/data.orc")</w:t>
+            </w:r>
+          </w:p>
+          <w:p>
+            <w:pPr>
+              <w:spacing w:line="240" w:lineRule="auto"/>
+              <w:rPr>
+                <w:shd w:val="clear" w:color="auto" w:fill="F9F9F9"/>
+              </w:rPr>
+            </w:pPr>
+          </w:p>
+        </w:tc>
+      </w:tr>
+    </w:tbl>
+    <w:p>
+      <w:pPr>
+        <w:spacing w:line="240" w:lineRule="auto"/>
+        <w:rPr>
+          <w:shd w:val="clear" w:color="auto" w:fill="F9F9F9"/>
+        </w:rPr>
+      </w:pPr>
+    </w:p>
+    <w:p>
+      <w:pPr>
+        <w:spacing w:line="240" w:lineRule="auto"/>
+        <w:rPr>
+          <w:shd w:val="clear" w:color="auto" w:fill="F9F9F9"/>
+        </w:rPr>
+      </w:pPr>
+    </w:p>
+    <w:tbl>
+      <w:tblPr>
+        <w:tblW w:w="9030" w:type="dxa"/>
+        <w:tblBorders>
+          <w:top w:val="single" w:sz="8" w:space="0" w:color="000000"/>
+          <w:left w:val="single" w:sz="8" w:space="0" w:color="000000"/>
+          <w:bottom w:val="single" w:sz="8" w:space="0" w:color="000000"/>
+          <w:right w:val="single" w:sz="8" w:space="0" w:color="000000"/>
+          <w:insideH w:val="single" w:sz="8" w:space="0" w:color="000000"/>
+          <w:insideV w:val="single" w:sz="8" w:space="0" w:color="000000"/>
+        </w:tblBorders>
+        <w:tblLayout w:type="fixed"/>
+        <w:tblLook w:val="0600" w:firstRow="0" w:lastRow="0" w:firstColumn="0" w:lastColumn="0" w:noHBand="1" w:noVBand="1"/>
+      </w:tblPr>
+      <w:tblGrid>
+        <w:gridCol w:w="9030"/>
+      </w:tblGrid>
+      <w:tr>
+        <w:tc>
+          <w:tcPr>
+            <w:tcW w:w="9029" w:type="dxa"/>
+            <w:tcBorders>
+              <w:top w:val="single" w:sz="8" w:space="0" w:color="000000"/>
+              <w:left w:val="single" w:sz="8" w:space="0" w:color="000000"/>
+              <w:bottom w:val="single" w:sz="8" w:space="0" w:color="000000"/>
+              <w:right w:val="single" w:sz="8" w:space="0" w:color="000000"/>
+            </w:tcBorders>
+            <w:tcMar>
+              <w:top w:w="100" w:type="dxa"/>
+              <w:left w:w="100" w:type="dxa"/>
+              <w:bottom w:w="100" w:type="dxa"/>
+              <w:right w:w="100" w:type="dxa"/>
+            </w:tcMar>
+          </w:tcPr>
+          <w:p>
+            <w:pPr>
+              <w:spacing w:line="240" w:lineRule="auto"/>
+              <w:rPr>
+                <w:shd w:val="clear" w:color="auto" w:fill="F9F9F9"/>
+              </w:rPr>
+            </w:pPr>
+          </w:p>
+          <w:p>
+            <w:pPr>
+              <w:spacing w:line="240" w:lineRule="auto"/>
+              <w:rPr>
+                <w:shd w:val="clear" w:color="auto" w:fill="F9F9F9"/>
+              </w:rPr>
+            </w:pPr>
+            <w:r>
+              <w:rPr>
+                <w:shd w:val="clear" w:color="auto" w:fill="F9F9F9"/>
+              </w:rPr>
+              <w:t xml:space="preserve">  </w:t>
+            </w:r>
+          </w:p>
+          <w:p>
+            <w:pPr>
+              <w:spacing w:line="240" w:lineRule="auto"/>
+              <w:rPr>
+                <w:shd w:val="clear" w:color="auto" w:fill="F9F9F9"/>
+              </w:rPr>
+            </w:pPr>
+            <w:proofErr w:type="spellStart"/>
+            <w:r>
+              <w:rPr>
+                <w:shd w:val="clear" w:color="auto" w:fill="F9F9F9"/>
+              </w:rPr>
+              <w:t>df</w:t>
+            </w:r>
+            <w:proofErr w:type="spellEnd"/>
+            <w:r>
+              <w:rPr>
+                <w:shd w:val="clear" w:color="auto" w:fill="F9F9F9"/>
+              </w:rPr>
+              <w:t xml:space="preserve"> = </w:t>
+            </w:r>
+            <w:proofErr w:type="spellStart"/>
+            <w:r>
+              <w:rPr>
+                <w:shd w:val="clear" w:color="auto" w:fill="F9F9F9"/>
+              </w:rPr>
+              <w:t>spark.read.orc</w:t>
+            </w:r>
+            <w:proofErr w:type="spellEnd"/>
+            <w:r>
+              <w:rPr>
+                <w:shd w:val="clear" w:color="auto" w:fill="F9F9F9"/>
+              </w:rPr>
+              <w:t>("file:///tmp/orc/data.orc")</w:t>
+            </w:r>
+          </w:p>
+          <w:p>
+            <w:pPr>
+              <w:spacing w:line="240" w:lineRule="auto"/>
+              <w:rPr>
+                <w:shd w:val="clear" w:color="auto" w:fill="F9F9F9"/>
+              </w:rPr>
+            </w:pPr>
+            <w:proofErr w:type="spellStart"/>
+            <w:r>
+              <w:rPr>
+                <w:shd w:val="clear" w:color="auto" w:fill="F9F9F9"/>
+              </w:rPr>
+              <w:t>df.printSchema</w:t>
+            </w:r>
+            <w:proofErr w:type="spellEnd"/>
+            <w:r>
+              <w:rPr>
+                <w:shd w:val="clear" w:color="auto" w:fill="F9F9F9"/>
+              </w:rPr>
+              <w:t>()</w:t>
+            </w:r>
+          </w:p>
+          <w:p>
+            <w:pPr>
+              <w:spacing w:line="240" w:lineRule="auto"/>
+              <w:rPr>
+                <w:shd w:val="clear" w:color="auto" w:fill="F9F9F9"/>
+              </w:rPr>
+            </w:pPr>
+            <w:proofErr w:type="spellStart"/>
+            <w:r>
+              <w:rPr>
+                <w:shd w:val="clear" w:color="auto" w:fill="F9F9F9"/>
+              </w:rPr>
+              <w:t>df.show</w:t>
+            </w:r>
+            <w:proofErr w:type="spellEnd"/>
+            <w:r>
+              <w:rPr>
+                <w:shd w:val="clear" w:color="auto" w:fill="F9F9F9"/>
+              </w:rPr>
+              <w:t>()</w:t>
+            </w:r>
+          </w:p>
+          <w:p>
+            <w:pPr>
+              <w:spacing w:line="240" w:lineRule="auto"/>
+              <w:rPr>
+                <w:shd w:val="clear" w:color="auto" w:fill="F9F9F9"/>
+              </w:rPr>
+            </w:pPr>
+          </w:p>
+          <w:p>
+            <w:pPr>
+              <w:spacing w:line="240" w:lineRule="auto"/>
+              <w:rPr>
+                <w:shd w:val="clear" w:color="auto" w:fill="F9F9F9"/>
+              </w:rPr>
+            </w:pPr>
+          </w:p>
+        </w:tc>
+      </w:tr>
+    </w:tbl>
+    <w:p>
+      <w:pPr>
+        <w:spacing w:line="240" w:lineRule="auto"/>
+        <w:rPr>
+          <w:shd w:val="clear" w:color="auto" w:fill="F9F9F9"/>
+        </w:rPr>
+      </w:pPr>
+    </w:p>
+    <w:p>
+      <w:pPr>
+        <w:spacing w:line="240" w:lineRule="auto"/>
+        <w:rPr>
+          <w:shd w:val="clear" w:color="auto" w:fill="F9F9F9"/>
+        </w:rPr>
+      </w:pPr>
+    </w:p>
+    <w:p>
+      <w:pPr>
+        <w:spacing w:line="240" w:lineRule="auto"/>
+        <w:rPr>
+          <w:shd w:val="clear" w:color="auto" w:fill="F9F9F9"/>
+        </w:rPr>
+      </w:pPr>
+      <w:r>
+        <w:rPr>
+          <w:b/>
+          <w:shd w:val="clear" w:color="auto" w:fill="F9F9F9"/>
+        </w:rPr>
+        <w:t xml:space="preserve">Run </w:t>
+      </w:r>
+      <w:proofErr w:type="spellStart"/>
+      <w:r>
+        <w:rPr>
+          <w:b/>
+          <w:shd w:val="clear" w:color="auto" w:fill="F9F9F9"/>
+        </w:rPr>
+        <w:t>sql</w:t>
+      </w:r>
+      <w:proofErr w:type="spellEnd"/>
+      <w:r>
+        <w:rPr>
+          <w:b/>
+          <w:shd w:val="clear" w:color="auto" w:fill="F9F9F9"/>
+        </w:rPr>
+        <w:t xml:space="preserve"> on Orc File</w:t>
+      </w:r>
+      <w:r>
+        <w:rPr>
+          <w:shd w:val="clear" w:color="auto" w:fill="F9F9F9"/>
+        </w:rPr>
+        <w:br/>
+      </w:r>
+    </w:p>
+    <w:tbl>
+      <w:tblPr>
+        <w:tblW w:w="9030" w:type="dxa"/>
+        <w:tblBorders>
+          <w:top w:val="single" w:sz="8" w:space="0" w:color="000000"/>
+          <w:left w:val="single" w:sz="8" w:space="0" w:color="000000"/>
+          <w:bottom w:val="single" w:sz="8" w:space="0" w:color="000000"/>
+          <w:right w:val="single" w:sz="8" w:space="0" w:color="000000"/>
+          <w:insideH w:val="single" w:sz="8" w:space="0" w:color="000000"/>
+          <w:insideV w:val="single" w:sz="8" w:space="0" w:color="000000"/>
+        </w:tblBorders>
+        <w:tblLayout w:type="fixed"/>
+        <w:tblLook w:val="0600" w:firstRow="0" w:lastRow="0" w:firstColumn="0" w:lastColumn="0" w:noHBand="1" w:noVBand="1"/>
+      </w:tblPr>
+      <w:tblGrid>
+        <w:gridCol w:w="9030"/>
+      </w:tblGrid>
+      <w:tr>
+        <w:tc>
+          <w:tcPr>
+            <w:tcW w:w="9029" w:type="dxa"/>
+            <w:tcBorders>
+              <w:top w:val="single" w:sz="8" w:space="0" w:color="000000"/>
+              <w:left w:val="single" w:sz="8" w:space="0" w:color="000000"/>
+              <w:bottom w:val="single" w:sz="8" w:space="0" w:color="000000"/>
+              <w:right w:val="single" w:sz="8" w:space="0" w:color="000000"/>
+            </w:tcBorders>
+            <w:tcMar>
+              <w:top w:w="100" w:type="dxa"/>
+              <w:left w:w="100" w:type="dxa"/>
+              <w:bottom w:w="100" w:type="dxa"/>
+              <w:right w:w="100" w:type="dxa"/>
+            </w:tcMar>
+          </w:tcPr>
+          <w:p>
+            <w:pPr>
+              <w:spacing w:line="240" w:lineRule="auto"/>
+              <w:rPr>
+                <w:shd w:val="clear" w:color="auto" w:fill="F9F9F9"/>
+              </w:rPr>
+            </w:pPr>
+          </w:p>
+          <w:p>
+            <w:pPr>
+              <w:spacing w:line="240" w:lineRule="auto"/>
+              <w:rPr>
+                <w:shd w:val="clear" w:color="auto" w:fill="F9F9F9"/>
+              </w:rPr>
+            </w:pPr>
+            <w:proofErr w:type="spellStart"/>
+            <w:r>
+              <w:rPr>
+                <w:shd w:val="clear" w:color="auto" w:fill="F9F9F9"/>
+              </w:rPr>
+              <w:t>df.createOrReplaceTempView</w:t>
+            </w:r>
+            <w:proofErr w:type="spellEnd"/>
+            <w:r>
+              <w:rPr>
+                <w:shd w:val="clear" w:color="auto" w:fill="F9F9F9"/>
+              </w:rPr>
+              <w:t>("</w:t>
+            </w:r>
+            <w:proofErr w:type="spellStart"/>
+            <w:r>
+              <w:rPr>
+                <w:shd w:val="clear" w:color="auto" w:fill="F9F9F9"/>
+              </w:rPr>
+              <w:t>ORCTable</w:t>
+            </w:r>
+            <w:proofErr w:type="spellEnd"/>
+            <w:r>
+              <w:rPr>
+                <w:shd w:val="clear" w:color="auto" w:fill="F9F9F9"/>
+              </w:rPr>
+              <w:t>")</w:t>
+            </w:r>
+          </w:p>
+          <w:p>
+            <w:pPr>
+              <w:spacing w:line="240" w:lineRule="auto"/>
+              <w:rPr>
+                <w:shd w:val="clear" w:color="auto" w:fill="F9F9F9"/>
+              </w:rPr>
+            </w:pPr>
+            <w:proofErr w:type="spellStart"/>
+            <w:r>
+              <w:rPr>
+                <w:shd w:val="clear" w:color="auto" w:fill="F9F9F9"/>
+              </w:rPr>
+              <w:t>orcSQL</w:t>
+            </w:r>
+            <w:proofErr w:type="spellEnd"/>
+            <w:r>
+              <w:rPr>
+                <w:shd w:val="clear" w:color="auto" w:fill="F9F9F9"/>
+              </w:rPr>
+              <w:t xml:space="preserve"> = </w:t>
+            </w:r>
+            <w:proofErr w:type="spellStart"/>
+            <w:r>
+              <w:rPr>
+                <w:shd w:val="clear" w:color="auto" w:fill="F9F9F9"/>
+              </w:rPr>
+              <w:t>spark.sql</w:t>
+            </w:r>
+            <w:proofErr w:type="spellEnd"/>
+            <w:r>
+              <w:rPr>
+                <w:shd w:val="clear" w:color="auto" w:fill="F9F9F9"/>
+              </w:rPr>
+              <w:t xml:space="preserve">("select </w:t>
+            </w:r>
+            <w:proofErr w:type="spellStart"/>
+            <w:r>
+              <w:rPr>
+                <w:shd w:val="clear" w:color="auto" w:fill="F9F9F9"/>
+              </w:rPr>
+              <w:t>firstname,dob</w:t>
+            </w:r>
+            <w:proofErr w:type="spellEnd"/>
+            <w:r>
+              <w:rPr>
+                <w:shd w:val="clear" w:color="auto" w:fill="F9F9F9"/>
+              </w:rPr>
+              <w:t xml:space="preserve"> from </w:t>
+            </w:r>
+            <w:proofErr w:type="spellStart"/>
+            <w:r>
+              <w:rPr>
+                <w:shd w:val="clear" w:color="auto" w:fill="F9F9F9"/>
+              </w:rPr>
+              <w:t>ORCTable</w:t>
+            </w:r>
+            <w:proofErr w:type="spellEnd"/>
+            <w:r>
+              <w:rPr>
+                <w:shd w:val="clear" w:color="auto" w:fill="F9F9F9"/>
+              </w:rPr>
+              <w:t xml:space="preserve"> where salary &gt;= 4000 ")</w:t>
+            </w:r>
+          </w:p>
+          <w:p>
+            <w:pPr>
+              <w:spacing w:line="240" w:lineRule="auto"/>
+              <w:rPr>
+                <w:shd w:val="clear" w:color="auto" w:fill="F9F9F9"/>
+              </w:rPr>
+            </w:pPr>
+            <w:proofErr w:type="spellStart"/>
+            <w:r>
+              <w:rPr>
+                <w:shd w:val="clear" w:color="auto" w:fill="F9F9F9"/>
+              </w:rPr>
+              <w:t>orcSQL.show</w:t>
+            </w:r>
+            <w:proofErr w:type="spellEnd"/>
+            <w:r>
+              <w:rPr>
+                <w:shd w:val="clear" w:color="auto" w:fill="F9F9F9"/>
+              </w:rPr>
+              <w:t>()</w:t>
+            </w:r>
+          </w:p>
+          <w:p>
+            <w:pPr>
+              <w:spacing w:line="240" w:lineRule="auto"/>
+              <w:rPr>
+                <w:shd w:val="clear" w:color="auto" w:fill="F9F9F9"/>
+              </w:rPr>
+            </w:pPr>
+          </w:p>
+          <w:p>
+            <w:pPr>
+              <w:spacing w:line="240" w:lineRule="auto"/>
+              <w:rPr>
+                <w:shd w:val="clear" w:color="auto" w:fill="F9F9F9"/>
+              </w:rPr>
+            </w:pPr>
+          </w:p>
+        </w:tc>
+      </w:tr>
+    </w:tbl>
+    <w:p>
+      <w:pPr>
+        <w:spacing w:line="240" w:lineRule="auto"/>
+        <w:rPr>
+          <w:shd w:val="clear" w:color="auto" w:fill="F9F9F9"/>
+        </w:rPr>
+      </w:pPr>
+    </w:p>
+    <w:p>
+      <w:pPr>
+        <w:spacing w:line="240" w:lineRule="auto"/>
+        <w:rPr>
+          <w:shd w:val="clear" w:color="auto" w:fill="F9F9F9"/>
+        </w:rPr>
+      </w:pPr>
+    </w:p>
+    <w:p>
+      <w:pPr>
+        <w:spacing w:line="240" w:lineRule="auto"/>
+        <w:rPr>
+          <w:shd w:val="clear" w:color="auto" w:fill="F9F9F9"/>
+        </w:rPr>
+      </w:pPr>
+      <w:r>
+        <w:rPr>
+          <w:shd w:val="clear" w:color="auto" w:fill="F9F9F9"/>
+        </w:rPr>
+        <w:t>*******************************</w:t>
+      </w:r>
+      <w:r>
+        <w:rPr>
+          <w:b/>
+          <w:shd w:val="clear" w:color="auto" w:fill="F9F9F9"/>
+        </w:rPr>
+        <w:t>Json</w:t>
+      </w:r>
+      <w:r>
+        <w:rPr>
+          <w:shd w:val="clear" w:color="auto" w:fill="F9F9F9"/>
+        </w:rPr>
+        <w:t>****************************************</w:t>
+      </w:r>
+    </w:p>
+    <w:p>
+      <w:pPr>
+        <w:spacing w:line="240" w:lineRule="auto"/>
+        <w:rPr>
+          <w:shd w:val="clear" w:color="auto" w:fill="F9F9F9"/>
+        </w:rPr>
+      </w:pPr>
+    </w:p>
+    <w:p>
+      <w:pPr>
+        <w:spacing w:line="240" w:lineRule="auto"/>
+        <w:rPr>
+          <w:shd w:val="clear" w:color="auto" w:fill="F9F9F9"/>
+        </w:rPr>
+      </w:pPr>
+    </w:p>
+    <w:tbl>
+      <w:tblPr>
+        <w:tblW w:w="9030" w:type="dxa"/>
+        <w:tblBorders>
+          <w:top w:val="single" w:sz="8" w:space="0" w:color="000000"/>
+          <w:left w:val="single" w:sz="8" w:space="0" w:color="000000"/>
+          <w:bottom w:val="single" w:sz="8" w:space="0" w:color="000000"/>
+          <w:right w:val="single" w:sz="8" w:space="0" w:color="000000"/>
+          <w:insideH w:val="single" w:sz="8" w:space="0" w:color="000000"/>
+          <w:insideV w:val="single" w:sz="8" w:space="0" w:color="000000"/>
+        </w:tblBorders>
+        <w:tblLayout w:type="fixed"/>
+        <w:tblLook w:val="0600" w:firstRow="0" w:lastRow="0" w:firstColumn="0" w:lastColumn="0" w:noHBand="1" w:noVBand="1"/>
+      </w:tblPr>
+      <w:tblGrid>
+        <w:gridCol w:w="9030"/>
+      </w:tblGrid>
+      <w:tr>
+        <w:tc>
+          <w:tcPr>
+            <w:tcW w:w="9029" w:type="dxa"/>
+            <w:tcBorders>
+              <w:top w:val="single" w:sz="8" w:space="0" w:color="000000"/>
+              <w:left w:val="single" w:sz="8" w:space="0" w:color="000000"/>
+              <w:bottom w:val="single" w:sz="8" w:space="0" w:color="000000"/>
+              <w:right w:val="single" w:sz="8" w:space="0" w:color="000000"/>
+            </w:tcBorders>
+            <w:tcMar>
+              <w:top w:w="100" w:type="dxa"/>
+              <w:left w:w="100" w:type="dxa"/>
+              <w:bottom w:w="100" w:type="dxa"/>
+              <w:right w:w="100" w:type="dxa"/>
+            </w:tcMar>
+          </w:tcPr>
+          <w:p>
+            <w:pPr>
+              <w:spacing w:line="240" w:lineRule="auto"/>
+              <w:rPr>
+                <w:shd w:val="clear" w:color="auto" w:fill="F9F9F9"/>
+              </w:rPr>
+            </w:pPr>
+          </w:p>
+          <w:p>
+            <w:pPr>
+              <w:spacing w:line="240" w:lineRule="auto"/>
+              <w:rPr>
+                <w:shd w:val="clear" w:color="auto" w:fill="F9F9F9"/>
+              </w:rPr>
+            </w:pPr>
+            <w:r>
+              <w:rPr>
+                <w:shd w:val="clear" w:color="auto" w:fill="F9F9F9"/>
+              </w:rPr>
+              <w:t xml:space="preserve"># Read JSON file into </w:t>
+            </w:r>
+            <w:proofErr w:type="spellStart"/>
+            <w:r>
+              <w:rPr>
+                <w:shd w:val="clear" w:color="auto" w:fill="F9F9F9"/>
+              </w:rPr>
+              <w:t>dataframe</w:t>
+            </w:r>
+            <w:proofErr w:type="spellEnd"/>
+          </w:p>
+          <w:p>
+            <w:pPr>
+              <w:spacing w:line="240" w:lineRule="auto"/>
+              <w:rPr>
+                <w:shd w:val="clear" w:color="auto" w:fill="F9F9F9"/>
+              </w:rPr>
+            </w:pPr>
+            <w:proofErr w:type="spellStart"/>
+            <w:r>
+              <w:rPr>
+                <w:shd w:val="clear" w:color="auto" w:fill="F9F9F9"/>
+              </w:rPr>
+              <w:t>parDF.write.json</w:t>
+            </w:r>
+            <w:proofErr w:type="spellEnd"/>
+            <w:r>
+              <w:rPr>
+                <w:shd w:val="clear" w:color="auto" w:fill="F9F9F9"/>
+              </w:rPr>
+              <w:t>("file:///tmp/json/data.json")</w:t>
+            </w:r>
+          </w:p>
+          <w:p>
+            <w:pPr>
+              <w:spacing w:line="240" w:lineRule="auto"/>
+              <w:rPr>
+                <w:shd w:val="clear" w:color="auto" w:fill="F9F9F9"/>
+              </w:rPr>
+            </w:pPr>
+          </w:p>
+          <w:p>
+            <w:pPr>
+              <w:spacing w:line="240" w:lineRule="auto"/>
+              <w:rPr>
+                <w:shd w:val="clear" w:color="auto" w:fill="F9F9F9"/>
+              </w:rPr>
+            </w:pPr>
+            <w:proofErr w:type="spellStart"/>
+            <w:r>
+              <w:rPr>
+                <w:shd w:val="clear" w:color="auto" w:fill="F9F9F9"/>
+              </w:rPr>
+              <w:t>df</w:t>
+            </w:r>
+            <w:proofErr w:type="spellEnd"/>
+            <w:r>
+              <w:rPr>
+                <w:shd w:val="clear" w:color="auto" w:fill="F9F9F9"/>
+              </w:rPr>
+              <w:t xml:space="preserve"> = </w:t>
+            </w:r>
+            <w:proofErr w:type="spellStart"/>
+            <w:r>
+              <w:rPr>
+                <w:shd w:val="clear" w:color="auto" w:fill="F9F9F9"/>
+              </w:rPr>
+              <w:t>spark.read.json</w:t>
+            </w:r>
+            <w:proofErr w:type="spellEnd"/>
+            <w:r>
+              <w:rPr>
+                <w:shd w:val="clear" w:color="auto" w:fill="F9F9F9"/>
+              </w:rPr>
+              <w:t>("file:///tmp/json/data.json")</w:t>
+            </w:r>
+          </w:p>
+          <w:p>
+            <w:pPr>
+              <w:spacing w:line="240" w:lineRule="auto"/>
+              <w:rPr>
+                <w:shd w:val="clear" w:color="auto" w:fill="F9F9F9"/>
+              </w:rPr>
+            </w:pPr>
+            <w:proofErr w:type="spellStart"/>
+            <w:r>
+              <w:rPr>
+                <w:shd w:val="clear" w:color="auto" w:fill="F9F9F9"/>
+              </w:rPr>
+              <w:t>df.printSchema</w:t>
+            </w:r>
+            <w:proofErr w:type="spellEnd"/>
+            <w:r>
+              <w:rPr>
+                <w:shd w:val="clear" w:color="auto" w:fill="F9F9F9"/>
+              </w:rPr>
+              <w:t>()</w:t>
+            </w:r>
+          </w:p>
+          <w:p>
+            <w:pPr>
+              <w:spacing w:line="240" w:lineRule="auto"/>
+              <w:rPr>
+                <w:shd w:val="clear" w:color="auto" w:fill="F9F9F9"/>
+              </w:rPr>
+            </w:pPr>
+            <w:proofErr w:type="spellStart"/>
+            <w:r>
+              <w:rPr>
+                <w:shd w:val="clear" w:color="auto" w:fill="F9F9F9"/>
+              </w:rPr>
+              <w:t>df.show</w:t>
+            </w:r>
+            <w:proofErr w:type="spellEnd"/>
+            <w:r>
+              <w:rPr>
+                <w:shd w:val="clear" w:color="auto" w:fill="F9F9F9"/>
+              </w:rPr>
+              <w:t>()</w:t>
+            </w:r>
+          </w:p>
+          <w:p>
+            <w:pPr>
+              <w:spacing w:line="240" w:lineRule="auto"/>
+              <w:rPr>
+                <w:shd w:val="clear" w:color="auto" w:fill="F9F9F9"/>
+              </w:rPr>
+            </w:pPr>
+          </w:p>
+          <w:p>
+            <w:pPr>
               <w:spacing w:line="240" w:lineRule="auto"/>
               <w:rPr>
                 <w:shd w:val="clear" w:color="auto" w:fill="F9F9F9"/>
@@ -4643,7 +6044,6 @@
   <w:style w:type="character" w:default="1" w:styleId="DefaultParagraphFont">
     <w:name w:val="Default Paragraph Font"/>
     <w:uiPriority w:val="1"/>
-    <w:semiHidden/>
     <w:unhideWhenUsed/>
   </w:style>
   <w:style w:type="table" w:default="1" w:styleId="TableNormal">

</xml_diff>